<commit_message>
Actualiza la documentacion con el cierre de NC-001 y NC-008
- Plan de pruebas version 2.3: bitacora (NC-001 y NC-008 cerradas el
  15/10/2026 tras la prueba de confirmacion), estado de los casos CP-004
  y CP-005, arquitectura, OWASP, riesgos (R01 baja a nivel medio) y
  conclusiones.
- Excel GA9-AA2-EV01: NC-001 cerrada en Seguimiento y en la matriz resumen.
- Guia conceptual y curso: estado actualizado; el curso pasa a
  "Archivos de estudio" junto al resto del material.
- herramientas/md2docx.js: conversor del plan de Markdown a Word (APA 7).

Co-Authored-By: Claude Opus 5.5 <noreply@anthropic.com>
</commit_message>
<xml_diff>
--- a/Documentacion/Archivos de estudio/Guia-Conceptual-Plan-de-Pruebas-GA9-PetConnect.docx
+++ b/Documentacion/Archivos de estudio/Guia-Conceptual-Plan-de-Pruebas-GA9-PetConnect.docx
@@ -5804,7 +5804,7 @@
         <w:ind w:firstLine="720"/>
       </w:pPr>
       <w:r>
-        <w:t xml:space="preserve">SHA-256 fue diseñado para ser rápido, lo que es una ventaja para verificar archivos y una desventaja para contraseñas: una tarjeta gráfica moderna calcula miles de millones de hashes SHA-256 por segundo, así que un atacante con la base de datos robada puede probar diccionarios enormes en minutos. Además, el código de PetConnect no usa sal, de modo que dos usuarios con la contraseña "Firulais2024" tienen exactamente el mismo hash, y basta con descifrar uno.</w:t>
+        <w:t xml:space="preserve">SHA-256 fue diseñado para ser rápido, lo que es una ventaja para verificar archivos y una desventaja para contraseñas: una tarjeta gráfica moderna calcula miles de millones de hashes SHA-256 por segundo, así que un atacante con la base de datos robada puede probar diccionarios enormes en minutos. Además, hasta la corrección del 15 de octubre el código de PetConnect no usaba sal, de modo que dos usuarios con la contraseña "Firulais2024" tenían exactamente el mismo hash, y bastaba con descifrar uno.</w:t>
       </w:r>
     </w:p>
     <w:p>
@@ -5944,7 +5944,7 @@
         <w:t xml:space="preserve">sub</w:t>
       </w:r>
       <w:r>
-        <w:t xml:space="preserve"> sea texto (Jones et al., 2015). PetConnect lo emite como número y la versión actual de la librería PyJWT lo rechaza. Ese es el defecto NC-008, que hace que todas las rutas protegidas respondan "token inválido".</w:t>
+        <w:t xml:space="preserve"> sea texto (Jones et al., 2015). PetConnect lo emitía como número y la versión actual de la librería PyJWT lo rechazaba. Ese era el defecto NC-008, que hacía que todas las rutas protegidas respondieran "token inválido"; se corrigió el 15 de octubre emitiendo el usuario como texto.</w:t>
       </w:r>
     </w:p>
     <w:p>
@@ -6557,7 +6557,7 @@
         <w:ind w:firstLine="720"/>
       </w:pPr>
       <w:r>
-        <w:t xml:space="preserve">Cada desviación se registra con su severidad y su estado. La severidad mide el daño técnico (crítica, alta, media o baja). La prioridad, en cambio, mide la urgencia de corregirla, y no siempre coinciden: un error de ortografía en la pantalla de inicio tiene severidad baja pero puede tener prioridad alta, porque es lo primero que ve el instructor. El estado sigue el ciclo abierta, en corrección, en verificación y cerrada. Una no conformidad solo se cierra cuando la prueba de confirmación pasa, no cuando el desarrollador dice que la corrigió.</w:t>
+        <w:t xml:space="preserve">Cada desviación se registra con su severidad y su estado. La severidad mide el daño técnico (crítica, alta, media o baja). La prioridad, en cambio, mide la urgencia de corregirla, y no siempre coinciden: un error de ortografía en la pantalla de inicio tiene severidad baja pero puede tener prioridad alta, porque es lo primero que ve el instructor. El estado sigue el ciclo abierta, en corrección, en verificación y cerrada. Una no conformidad solo se cierra cuando la prueba de confirmación pasa, no cuando el desarrollador dice que la corrigió. Así se cerraron NC-001 y NC-008 el 15 de octubre: después de corregir el código, se repitieron contra la base de datos los flujos que habían fallado y las cuatro verificaciones pasaron.</w:t>
       </w:r>
     </w:p>
     <w:p>
@@ -6589,7 +6589,7 @@
         <w:ind w:firstLine="720"/>
       </w:pPr>
       <w:r>
-        <w:t xml:space="preserve">Un riesgo es algo que todavía no ha pasado pero podría pasar y causar daño. Se evalúa con dos números de 1 a 5: la probabilidad (qué tan posible es) y el impacto (cuánto daño causaría). El nivel es su producto: Nivel = Probabilidad × Impacto. El riesgo R01 (inseguridad de contraseñas) tiene probabilidad 4 e impacto 5, así que su nivel es 20, crítico. En el plan, un nivel de 1 a 5 es bajo; de 6 a 10, medio; de 12 a 16, alto; y de 20 a 25, crítico.</w:t>
+        <w:t xml:space="preserve">Un riesgo es algo que todavía no ha pasado pero podría pasar y causar daño. Se evalúa con dos números de 1 a 5: la probabilidad (qué tan posible es) y el impacto (cuánto daño causaría). El nivel es su producto: Nivel = Probabilidad × Impacto. El riesgo R01 (inseguridad de contraseñas) tenía probabilidad 4 e impacto 5, así que su nivel era 20, crítico. Cuando se corrigió NC-001, su probabilidad bajó a 2 y su nivel quedó en 10, medio. En el plan, un nivel de 1 a 5 es bajo; de 6 a 10, medio; de 12 a 16, alto; y de 20 a 25, crítico.</w:t>
       </w:r>
     </w:p>
     <w:p>
@@ -6597,7 +6597,7 @@
         <w:ind w:firstLine="720"/>
       </w:pPr>
       <w:r>
-        <w:t xml:space="preserve">Cada riesgo tiene dos respuestas. La mitigación es lo que se hace antes, para que el riesgo no ocurra o duela menos (pasar a bcrypt en el Sprint 1). La contingencia es lo que se hará si de todas formas ocurre (obligar a todos los usuarios a cambiar la contraseña y avisar a la autoridad de protección de datos). R01 y R02 son críticos porque la vulnerabilidad ya existe en el código y el daño recaería sobre los datos de los usuarios. R03 (desempeño) subió a crítico después del 5 de octubre: la prueba con 500 usuarios lo materializó, porque falló el 56 % de las solicitudes.</w:t>
+        <w:t xml:space="preserve">Cada riesgo tiene dos respuestas. La mitigación es lo que se hace antes, para que el riesgo no ocurra o duela menos (pasar a bcrypt en el Sprint 1). La contingencia es lo que se hará si de todas formas ocurre (obligar a todos los usuarios a cambiar la contraseña y avisar a la autoridad de protección de datos). R02 es crítico porque la vulnerabilidad ya existe en el código y el daño recaería sobre los datos de los usuarios; R01 también lo era hasta el 15 de octubre, cuando se corrigió NC-001. R03 (desempeño) subió a crítico después del 5 de octubre: la prueba con 500 usuarios lo materializó, porque falló el 56 % de las solicitudes.</w:t>
       </w:r>
     </w:p>
     <w:p>
@@ -6613,7 +6613,7 @@
         <w:ind w:firstLine="720"/>
       </w:pPr>
       <w:r>
-        <w:t xml:space="preserve">La Tabla 6 resume qué está mal en cada caso, por qué importa y cómo se corrige. Conviene conocerla bien, porque es la parte del plan con evidencia concreta del proyecto. NC-001 a NC-008 salieron de la revisión del 2 de octubre; NC-009 a NC-011, de la ejecución de casos del 5 de octubre (evidencia GA9-220501096-AA2-EV01).</w:t>
+        <w:t xml:space="preserve">La Tabla 6 resume qué está mal en cada caso, por qué importa y cómo se corrige. Conviene conocerla bien, porque es la parte del plan con evidencia concreta del proyecto. NC-001 a NC-008 salieron de la revisión del 2 de octubre; NC-009 a NC-011, de la ejecución de casos del 5 de octubre (evidencia GA9-220501096-AA2-EV01). NC-001 y NC-008 se corrigieron y cerraron el 15 de octubre, después de aprobar su prueba de confirmación.</w:t>
       </w:r>
     </w:p>
     <w:p>
@@ -6836,7 +6836,7 @@
                 <w:sz w:val="20"/>
                 <w:szCs w:val="20"/>
               </w:rPr>
-              <w:t xml:space="preserve">Las contraseñas se guardan con SHA-256 sin sal</w:t>
+              <w:t xml:space="preserve">Las contraseñas se guardaban con SHA-256 sin sal</w:t>
             </w:r>
           </w:p>
         </w:tc>
@@ -6882,7 +6882,7 @@
                 <w:sz w:val="20"/>
                 <w:szCs w:val="20"/>
               </w:rPr>
-              <w:t xml:space="preserve">Usar bcrypt con costo 12 y migrar los hashes antiguos</w:t>
+              <w:t xml:space="preserve">Cerrada el 15/10/2026: ahora se usa bcrypt con costo 12 y los hashes antiguos se migran al iniciar sesión</w:t>
             </w:r>
           </w:p>
         </w:tc>
@@ -7515,7 +7515,7 @@
                 <w:sz w:val="20"/>
                 <w:szCs w:val="20"/>
               </w:rPr>
-              <w:t xml:space="preserve">El token se emite con el usuario como número y la librería lo rechaza</w:t>
+              <w:t xml:space="preserve">El token se emitía con el usuario como número y la librería lo rechazaba</w:t>
             </w:r>
           </w:p>
         </w:tc>
@@ -7538,7 +7538,7 @@
                 <w:sz w:val="20"/>
                 <w:szCs w:val="20"/>
               </w:rPr>
-              <w:t xml:space="preserve">Ninguna ruta protegida funciona, aunque el usuario haya iniciado sesión</w:t>
+              <w:t xml:space="preserve">Ninguna ruta protegida funcionaba, aunque el usuario hubiera iniciado sesión</w:t>
             </w:r>
           </w:p>
         </w:tc>
@@ -7561,7 +7561,7 @@
                 <w:sz w:val="20"/>
                 <w:szCs w:val="20"/>
               </w:rPr>
-              <w:t xml:space="preserve">Emitir el usuario como texto y fijar las versiones de las librerías</w:t>
+              <w:t xml:space="preserve">Cerrada el 15/10/2026: el usuario se emite como texto y las versiones de las librerías quedaron fijas</w:t>
             </w:r>
           </w:p>
         </w:tc>
@@ -9517,7 +9517,7 @@
         <w:ind w:firstLine="720"/>
       </w:pPr>
       <w:r>
-        <w:t xml:space="preserve">Multiplicando la probabilidad por el impacto, ambos de 1 a 5. R01 tiene probabilidad 4 e impacto 5, así que su nivel es 20, crítico.</w:t>
+        <w:t xml:space="preserve">Multiplicando la probabilidad por el impacto, ambos de 1 a 5. R02 tiene probabilidad 4 e impacto 5, así que su nivel es 20, crítico.</w:t>
       </w:r>
     </w:p>
     <w:p>
@@ -9537,7 +9537,7 @@
         <w:ind w:firstLine="720"/>
       </w:pPr>
       <w:r>
-        <w:t xml:space="preserve">No se libera el sistema. NC-001 y NC-002 son criterios de salida bloqueantes: aunque todos los demás casos pasen, sin su corrección y su prueba de confirmación aprobada no hay liberación.</w:t>
+        <w:t xml:space="preserve">No se libera el sistema. NC-001 y NC-002 son criterios de salida bloqueantes: aunque todos los demás casos pasen, sin su corrección y su prueba de confirmación aprobada no hay liberación. NC-001 ya se corrigió y se cerró el 15 de octubre; NC-002 sigue abierta.</w:t>
       </w:r>
     </w:p>
     <w:p>

</xml_diff>